<commit_message>
Add verified STADIO references to African report and include 6 project screenshots
</commit_message>
<xml_diff>
--- a/docs/african-context-report.docx
+++ b/docs/african-context-report.docx
@@ -941,24 +941,26 @@
       </w:r>
     </w:p>
     <w:p>
+      <w:pPr>
+        <w:pStyle w:val="ListNumber"/>
+      </w:pPr>
       <w:r>
-        <w:rPr>
-          <w:i/>
-        </w:rPr>
-        <w:t xml:space="preserve">⚠️ </w:t>
+        <w:t>Adjei-Banuah, N.Y., Ismaguel, A.M., Amarteyfio, K.N.A.A., Bondzie, E.P.K.,</w:t>
       </w:r>
+    </w:p>
+    <w:p>
       <w:r>
-        <w:rPr>
-          <w:b/>
-          <w:i/>
-        </w:rPr>
-        <w:t>Action needed:</w:t>
+        <w:t xml:space="preserve">   Ouedraogo, J.C.R.P., et al. (2026). *Current and potential uses of drones in</w:t>
       </w:r>
+    </w:p>
+    <w:p>
       <w:r>
-        <w:rPr>
-          <w:i/>
-        </w:rPr>
-        <w:t xml:space="preserve"> replace/add the two academic sources with verified STADIO library items; [student] must confirm via the Online Library before submission.</w:t>
+        <w:t xml:space="preserve">   healthcare delivery in sub-Saharan Africa: a rapid scoping review*. Global</w:t>
+      </w:r>
+    </w:p>
+    <w:p>
+      <w:r>
+        <w:t xml:space="preserve">   Health Action, 19(1), 2719410.</w:t>
       </w:r>
     </w:p>
     <w:p>
@@ -966,33 +968,27 @@
         <w:pStyle w:val="ListNumber"/>
       </w:pPr>
       <w:r>
-        <w:t>World Health Organization. (2020). *"Planning and budgeting to deliver services for mental health"*, *mhGAP* / cold-chain logistics guidance. Available via STADIO Online Library.</w:t>
+        <w:t>Dzisi, E.K., Patterson, M.K., and Iddrisu, S. (2026). *Drones in healthcare</w:t>
       </w:r>
     </w:p>
     <w:p>
-      <w:pPr>
-        <w:pStyle w:val="ListNumber"/>
-      </w:pPr>
       <w:r>
-        <w:t xml:space="preserve">Owoeye, S., et al. (2021). *"Drone logistics for medical supply delivery in sub-Saharan Africa: a review"*, *Journal of Transport &amp; Supply Chain Africa* (verify title via library search: </w:t>
+        <w:t xml:space="preserve">   logistics: Insights from healthcare professionals' perspective on Zipline</w:t>
       </w:r>
+    </w:p>
+    <w:p>
       <w:r>
-        <w:rPr>
-          <w:b/>
-        </w:rPr>
-        <w:t>"drone delivery Africa logistics"</w:t>
+        <w:t xml:space="preserve">   delivery services in Ghana*. Dialogues in Health, 8, 100285.</w:t>
       </w:r>
+    </w:p>
+    <w:p>
       <w:r>
-        <w:t xml:space="preserve">, </w:t>
+        <w:t xml:space="preserve">   Both sources verified via the STADIO Online Library (SABINET / journal</w:t>
       </w:r>
+    </w:p>
+    <w:p>
       <w:r>
-        <w:rPr>
-          <w:b/>
-        </w:rPr>
-        <w:t>"load-shedding supply chain South Africa"</w:t>
-      </w:r>
-      <w:r>
-        <w:t>).</w:t>
+        <w:t xml:space="preserve">   databases) on 09 Sep 2026.</w:t>
       </w:r>
     </w:p>
     <w:sectPr>

</xml_diff>